<commit_message>
docs: update the author degree in the preliminary-results document
The author line now records the bachelor's degree in Sistemas de Informacao
(UMC) in place of the MBA in progress, matching the author block of the
final monograph.

Co-Authored-By: Claude Opus 5 <noreply@anthropic.com>
</commit_message>
<xml_diff>
--- a/docs/monography/Resultados Preliminares - Artur Rios da Silva Oliveira.docx
+++ b/docs/monography/Resultados Preliminares - Artur Rios da Silva Oliveira.docx
@@ -90,7 +90,35 @@
           <w:sz w:val="18"/>
           <w:szCs w:val="18"/>
         </w:rPr>
-        <w:t>[Titulação]. MBA em Engenharia de Software, USP/Esalq. E-mail autor correspondente: arturdev@duck.com</w:t>
+        <w:t xml:space="preserve">[Titulação]. </w:t>
+      </w:r>
+      <w:r>
+        <w:rPr>
+          <w:sz w:val="18"/>
+          <w:szCs w:val="18"/>
+        </w:rPr>
+        <w:t>Bacharel em Sistemas de Informação</w:t>
+      </w:r>
+      <w:r>
+        <w:rPr>
+          <w:sz w:val="18"/>
+          <w:szCs w:val="18"/>
+        </w:rPr>
+        <w:t xml:space="preserve">, </w:t>
+      </w:r>
+      <w:r>
+        <w:rPr>
+          <w:sz w:val="18"/>
+          <w:szCs w:val="18"/>
+        </w:rPr>
+        <w:t>UMC</w:t>
+      </w:r>
+      <w:r>
+        <w:rPr>
+          <w:sz w:val="18"/>
+          <w:szCs w:val="18"/>
+        </w:rPr>
+        <w:t>. E-mail autor correspondente: arturdev@duck.com</w:t>
       </w:r>
     </w:p>
     <w:p>
@@ -219,16 +247,7 @@
         <w:spacing w:line="240" w:lineRule="auto"/>
       </w:pPr>
       <w:r>
-        <w:t xml:space="preserve">A conciliação contábil é uma atividade essencial para assegurar a integridade dos registros financeiros das organizações, sendo ainda, em muitos casos, executada de forma manual e, por isso, suscetível a erros e de difícil escalabilidade. Este trabalho teve por objetivo investigar a aplicação de técnicas de aprendizado de máquina supervisionado à automação da conciliação entre registros de pagamentos e notas fiscais eletrônicas de serviço, avaliando qual algoritmo apresenta melhor desempenho e como o rigor </w:t>
-      </w:r>
-      <w:r>
-        <w:t>dos critérios de conciliação afeta esse resultado. Foram gerados dados sintéticos representando 7.500 pagamentos a fornecedores, em planilha eletrônica, e as correspondentes notas fiscais eletrônicas de serviço (NFS-e), em formato XML no padrão ABRASF. Os dados foram submetidos a um processo de extração, transformação e carga (ETL) e rotulados segundo dois cenários: conciliação exata e conciliação flexível. Três algoritmos — Floresta Aleatória, Máquina de Vetores de Suporte e Regressão Logística — foram tre</w:t>
-      </w:r>
-      <w:r>
-        <w:t>inados e validados por validação cruzada estratificada, sendo o desempenho aferido por acurácia, precisão, revocação e medida F1. Os resultados preliminares indicaram que a Floresta Aleatória obteve o melhor desempenho em ambos os cenários, superando os demais algoritmos em todas as métricas, o que evidencia o potencial das técnicas de aprendizado de máquina para automatizar a conciliação contábil com maior agilidade e precisão. Discutem-se, ainda, as limitações associadas ao uso de dados simulados e a rele</w:t>
-      </w:r>
-      <w:r>
-        <w:t>vância dos atributos derivados das diferenças de data e de valor.</w:t>
+        <w:t>A conciliação contábil é uma atividade essencial para assegurar a integridade dos registros financeiros das organizações, sendo ainda, em muitos casos, executada de forma manual e, por isso, suscetível a erros e de difícil escalabilidade. Este trabalho teve por objetivo investigar a aplicação de técnicas de aprendizado de máquina supervisionado à automação da conciliação entre registros de pagamentos e notas fiscais eletrônicas de serviço, avaliando qual algoritmo apresenta melhor desempenho e como o rigor dos critérios de conciliação afeta esse resultado. Foram gerados dados sintéticos representando 7.500 pagamentos a fornecedores, em planilha eletrônica, e as correspondentes notas fiscais eletrônicas de serviço (NFS-e), em formato XML no padrão ABRASF. Os dados foram submetidos a um processo de extração, transformação e carga (ETL) e rotulados segundo dois cenários: conciliação exata e conciliação flexível. Três algoritmos — Floresta Aleatória, Máquina de Vetores de Suporte e Regressão Logística — foram treinados e validados por validação cruzada estratificada, sendo o desempenho aferido por acurácia, precisão, revocação e medida F1. Os resultados preliminares indicaram que a Floresta Aleatória obteve o melhor desempenho em ambos os cenários, superando os demais algoritmos em todas as métricas, o que evidencia o potencial das técnicas de aprendizado de máquina para automatizar a conciliação contábil com maior agilidade e precisão. Discutem-se, ainda, as limitações associadas ao uso de dados simulados e a relevância dos atributos derivados das diferenças de data e de valor.</w:t>
       </w:r>
     </w:p>
     <w:p>
@@ -281,13 +300,7 @@
         <w:ind w:firstLine="709"/>
       </w:pPr>
       <w:r>
-        <w:t>A crescente complexidade dos processos contábeis e financeiros nas organizações tem exigido soluções cada vez mais sofisticadas para garantir a confiabilidade das informações e a agilidade na tomada de decisão. A conciliação contábil, fundamental para assegurar a integridade dos registros e a conformidade com normas regulatórias, pode ser definida como a atividade de conferir e compatibilizar dados de transações financeiras gerados por diferentes sistemas ou subsistemas, com base em documentos-fonte padroni</w:t>
-      </w:r>
-      <w:r>
-        <w:t xml:space="preserve">zados, para identificar e corrigir erros, detectar fraudes e garantir que os saldos finais reflitam a realidade econômica (Mahmud e Fitriani, 2025). Tal atividade ainda é realizada em muitas empresas de forma manual ou semiautomática, o que gera elevado consumo de tempo, suscetibilidade a erros humanos e dificuldades de escalabilidade. Nesse contexto, o uso da tecnologia pode produzir ferramentas capazes de transformar processos tradicionais, trazendo maior eficiência, precisão e capacidade de adaptação às </w:t>
-      </w:r>
-      <w:r>
-        <w:t>demandas dinâmicas do mercado.</w:t>
+        <w:t>A crescente complexidade dos processos contábeis e financeiros nas organizações tem exigido soluções cada vez mais sofisticadas para garantir a confiabilidade das informações e a agilidade na tomada de decisão. A conciliação contábil, fundamental para assegurar a integridade dos registros e a conformidade com normas regulatórias, pode ser definida como a atividade de conferir e compatibilizar dados de transações financeiras gerados por diferentes sistemas ou subsistemas, com base em documentos-fonte padronizados, para identificar e corrigir erros, detectar fraudes e garantir que os saldos finais reflitam a realidade econômica (Mahmud e Fitriani, 2025). Tal atividade ainda é realizada em muitas empresas de forma manual ou semiautomática, o que gera elevado consumo de tempo, suscetibilidade a erros humanos e dificuldades de escalabilidade. Nesse contexto, o uso da tecnologia pode produzir ferramentas capazes de transformar processos tradicionais, trazendo maior eficiência, precisão e capacidade de adaptação às demandas dinâmicas do mercado.</w:t>
       </w:r>
     </w:p>
     <w:p>
@@ -309,10 +322,7 @@
         <w:ind w:firstLine="709"/>
       </w:pPr>
       <w:r>
-        <w:t>Serviços de automação vêm se tornando uma tendência cada vez mais presente em diversos setores, impulsionados pelos avanços recentes da Inteligência Artificial (IA) e do aprendizado de máquina (Soni et al., 2020). O aprendizado de máquina é um campo da inteligência artificial no qual se elaboram algoritmos para ensinar uma máquina a executar determinada tarefa. A partir de um conjunto de dados, exploram-se as correlações entre os atributos, descobrindo padrões e aplicando algoritmos que tornam possível, com</w:t>
-      </w:r>
-      <w:r>
-        <w:t xml:space="preserve"> base nesses padrões, produzir as saídas desejadas; cada registro do conjunto de dados possui características próprias e contribui para gerar modelos que podem ser generalizados para uma tarefa específica (França et al., 2021).</w:t>
+        <w:t>Serviços de automação vêm se tornando uma tendência cada vez mais presente em diversos setores, impulsionados pelos avanços recentes da Inteligência Artificial (IA) e do aprendizado de máquina (Soni et al., 2020). O aprendizado de máquina é um campo da inteligência artificial no qual se elaboram algoritmos para ensinar uma máquina a executar determinada tarefa. A partir de um conjunto de dados, exploram-se as correlações entre os atributos, descobrindo padrões e aplicando algoritmos que tornam possível, com base nesses padrões, produzir as saídas desejadas; cada registro do conjunto de dados possui características próprias e contribui para gerar modelos que podem ser generalizados para uma tarefa específica (França et al., 2021).</w:t>
       </w:r>
     </w:p>
     <w:p>
@@ -339,10 +349,7 @@
         <w:ind w:firstLine="709"/>
       </w:pPr>
       <w:r>
-        <w:t>Diante desse cenário, a hipótese que orienta esta pesquisa é a de que a aplicação de algoritmos de aprendizado de máquina, em conjunto com um processo de ETL, pode não apenas automatizar a conciliação contábil, mas também aprimorar sua qualidade, identificando padrões e antecipando inconsistências que passariam despercebidas em abordagens tradicionais. Assim, este trabalho tem por objetivo investigar como técnicas de aprendizado de máquina podem ser aplicadas à conciliação contábil, avaliando sua eficácia e</w:t>
-      </w:r>
-      <w:r>
-        <w:t xml:space="preserve"> os benefícios potenciais para a gestão financeira das organizações, mediante a aplicação de algoritmos supervisionados a um conjunto de dados construído para simular uma situação em que é necessária a conciliação de registros de pagamentos e de notas fiscais, bem como verificar de que forma o grau de rigor dos critérios de conciliação influencia o desempenho relativo dos algoritmos.</w:t>
+        <w:t>Diante desse cenário, a hipótese que orienta esta pesquisa é a de que a aplicação de algoritmos de aprendizado de máquina, em conjunto com um processo de ETL, pode não apenas automatizar a conciliação contábil, mas também aprimorar sua qualidade, identificando padrões e antecipando inconsistências que passariam despercebidas em abordagens tradicionais. Assim, este trabalho tem por objetivo investigar como técnicas de aprendizado de máquina podem ser aplicadas à conciliação contábil, avaliando sua eficácia e os benefícios potenciais para a gestão financeira das organizações, mediante a aplicação de algoritmos supervisionados a um conjunto de dados construído para simular uma situação em que é necessária a conciliação de registros de pagamentos e de notas fiscais, bem como verificar de que forma o grau de rigor dos critérios de conciliação influencia o desempenho relativo dos algoritmos.</w:t>
       </w:r>
     </w:p>
     <w:p>
@@ -376,10 +383,7 @@
         <w:ind w:firstLine="709"/>
       </w:pPr>
       <w:r>
-        <w:t>A presente pesquisa caracteriza-se como um estudo de natureza aplicada, com abordagem quantitativa, pautado no delineamento de implementação de algoritmos de aprendizado de máquina. Esse tipo de pesquisa busca resolver um problema prático — neste caso, a conciliação contábil — por meio da construção e da avaliação de modelos computacionais. Todo o desenvolvimento foi conduzido na linguagem Python, com o apoio da biblioteca scikit-learn para o treinamento e a avaliação dos modelos (Pedregosa et al., 2011), e</w:t>
-      </w:r>
-      <w:r>
-        <w:t xml:space="preserve"> os parâmetros do experimento foram centralizados em um arquivo de configuração, de modo a garantir a reprodutibilidade integral dos resultados.</w:t>
+        <w:t>A presente pesquisa caracteriza-se como um estudo de natureza aplicada, com abordagem quantitativa, pautado no delineamento de implementação de algoritmos de aprendizado de máquina. Esse tipo de pesquisa busca resolver um problema prático — neste caso, a conciliação contábil — por meio da construção e da avaliação de modelos computacionais. Todo o desenvolvimento foi conduzido na linguagem Python, com o apoio da biblioteca scikit-learn para o treinamento e a avaliação dos modelos (Pedregosa et al., 2011), e os parâmetros do experimento foram centralizados em um arquivo de configuração, de modo a garantir a reprodutibilidade integral dos resultados.</w:t>
       </w:r>
     </w:p>
     <w:p>
@@ -388,10 +392,7 @@
         <w:ind w:firstLine="709"/>
       </w:pPr>
       <w:r>
-        <w:t>Para o desenvolvimento do estudo, foram gerados dados simulados, conforme permitido pelas normas institucionais para o curso de Engenharia de Software. A geração baseou-se em procedimentos estatísticos que asseguraram a representatividade de um cenário real de pagamentos e faturamento, com o emprego de uma semente aleatória fixa para garantir a reprodutibilidade. Foram criados dois conjuntos de dados heterogêneos: uma tabela em formato de planilha eletrônica (.xlsx), simulando o registro de 7.500 pagamentos</w:t>
-      </w:r>
-      <w:r>
-        <w:t xml:space="preserve"> a fornecedores de uma organização, e uma lista de notas fiscais eletrônicas de serviço (NFS-e) em formato XML, seguindo o padrão ABRASF vigente. Definiu-se que aproximadamente 70% dos pagamentos possuíam nota fiscal correspondente passível de conciliação, enquanto os 30% restantes representaram registros divergentes ou sem contrapartida.</w:t>
+        <w:t>Para o desenvolvimento do estudo, foram gerados dados simulados, conforme permitido pelas normas institucionais para o curso de Engenharia de Software. A geração baseou-se em procedimentos estatísticos que asseguraram a representatividade de um cenário real de pagamentos e faturamento, com o emprego de uma semente aleatória fixa para garantir a reprodutibilidade. Foram criados dois conjuntos de dados heterogêneos: uma tabela em formato de planilha eletrônica (.xlsx), simulando o registro de 7.500 pagamentos a fornecedores de uma organização, e uma lista de notas fiscais eletrônicas de serviço (NFS-e) em formato XML, seguindo o padrão ABRASF vigente. Definiu-se que aproximadamente 70% dos pagamentos possuíam nota fiscal correspondente passível de conciliação, enquanto os 30% restantes representaram registros divergentes ou sem contrapartida.</w:t>
       </w:r>
     </w:p>
     <w:p>
@@ -400,10 +401,7 @@
         <w:ind w:firstLine="709"/>
       </w:pPr>
       <w:r>
-        <w:t>O processo de manipulação dos dados seguiu o fluxo de ETL. Inicialmente, realizou-se uma análise exploratória para identificar a distribuição das variáveis, a presença de valores ausentes e possíveis discrepâncias. Em seguida, os dados passaram por etapas de normalização e limpeza, com o objetivo de unificar os formatos das chaves de conciliação presentes em ambas as fontes, como o CNPJ, as datas e os valores nominais, incluindo a validação dos dígitos verificadores do CNPJ. A rotulagem dos registros foi co</w:t>
-      </w:r>
-      <w:r>
-        <w:t>nduzida segundo dois cenários experimentais distintos: no cenário exato, exigiu-se convergência total de data e de valor (tolerância de zero dia e de 0%), resultando em duas classes (conciliado e não conciliado); no cenário flexível, admitiram-se tolerâncias de até cinco dias úteis e de 2% no valor, resultando em três classes (conciliado, parcialmente conciliado e não conciliado).</w:t>
+        <w:t>O processo de manipulação dos dados seguiu o fluxo de ETL. Inicialmente, realizou-se uma análise exploratória para identificar a distribuição das variáveis, a presença de valores ausentes e possíveis discrepâncias. Em seguida, os dados passaram por etapas de normalização e limpeza, com o objetivo de unificar os formatos das chaves de conciliação presentes em ambas as fontes, como o CNPJ, as datas e os valores nominais, incluindo a validação dos dígitos verificadores do CNPJ. A rotulagem dos registros foi conduzida segundo dois cenários experimentais distintos: no cenário exato, exigiu-se convergência total de data e de valor (tolerância de zero dia e de 0%), resultando em duas classes (conciliado e não conciliado); no cenário flexível, admitiram-se tolerâncias de até cinco dias úteis e de 2% no valor, resultando em três classes (conciliado, parcialmente conciliado e não conciliado).</w:t>
       </w:r>
     </w:p>
     <w:p>
@@ -425,10 +423,7 @@
         <w:ind w:firstLine="709"/>
       </w:pPr>
       <w:r>
-        <w:t>A fase de experimentação consistiu no treinamento de três algoritmos de aprendizado supervisionado: Floresta Aleatória (Random Forest), Máquina de Vetores de Suporte (SVM) e Regressão Logística. O conjunto de dados foi particionado em 80% para treinamento e 20% para teste, de forma estratificada. Os hiperparâmetros foram ajustados por busca em grade (GridSearchCV), com validação cruzada estratificada de cinco partições, utilizando a medida F1 macro como critério de otimização. Para mitigar o desbalanceament</w:t>
-      </w:r>
-      <w:r>
-        <w:t>o entre as classes, adotou-se a ponderação de classes nos três algoritmos.</w:t>
+        <w:t>A fase de experimentação consistiu no treinamento de três algoritmos de aprendizado supervisionado: Floresta Aleatória (Random Forest), Máquina de Vetores de Suporte (SVM) e Regressão Logística. O conjunto de dados foi particionado em 80% para treinamento e 20% para teste, de forma estratificada. Os hiperparâmetros foram ajustados por busca em grade (GridSearchCV), com validação cruzada estratificada de cinco partições, utilizando a medida F1 macro como critério de otimização. Para mitigar o desbalanceamento entre as classes, adotou-se a ponderação de classes nos três algoritmos.</w:t>
       </w:r>
     </w:p>
     <w:p>
@@ -1694,10 +1689,7 @@
         <w:ind w:firstLine="709"/>
       </w:pPr>
       <w:r>
-        <w:t>A análise da importância das variáveis (Figura 1) revelou que os atributos delta_valor_pct e delta_days concentraram, conjuntamente, a quase totalidade do poder preditivo do modelo, seguidos, com participação bem menor, pela alíquota e pelo valor do ISS. Esse comportamento é coerente com a lógica de negócio da conciliação, na qual a proximidade de datas e de valores entre as fontes é o principal indício de correspondência entre um pagamento e a respectiva nota fiscal. Cabe ressaltar, contudo, que esses dois</w:t>
-      </w:r>
-      <w:r>
-        <w:t xml:space="preserve"> atributos derivam diretamente dos mesmos campos utilizados na rotulagem, o que ajuda a explicar o desempenho máximo da Floresta Aleatória e deve ser interpretado com cautela, conforme discutido adiante.</w:t>
+        <w:t>A análise da importância das variáveis (Figura 1) revelou que os atributos delta_valor_pct e delta_days concentraram, conjuntamente, a quase totalidade do poder preditivo do modelo, seguidos, com participação bem menor, pela alíquota e pelo valor do ISS. Esse comportamento é coerente com a lógica de negócio da conciliação, na qual a proximidade de datas e de valores entre as fontes é o principal indício de correspondência entre um pagamento e a respectiva nota fiscal. Cabe ressaltar, contudo, que esses dois atributos derivam diretamente dos mesmos campos utilizados na rotulagem, o que ajuda a explicar o desempenho máximo da Floresta Aleatória e deve ser interpretado com cautela, conforme discutido adiante.</w:t>
       </w:r>
     </w:p>
     <w:p>
@@ -1851,10 +1843,7 @@
         <w:ind w:firstLine="709"/>
       </w:pPr>
       <w:r>
-        <w:t xml:space="preserve">A matriz de confusão da SVM no cenário exato (Figura 3) detalha a natureza dos erros dos modelos de menor desempenho: dos 1.504 registros do conjunto de teste, o algoritmo classificou corretamente todos os 1.050 pagamentos efetivamente conciliados (nenhum falso negativo), mas atribuiu indevidamente a classe conciliado a 130 dos 454 registros não conciliados. Em termos práticos, isso significa alta sensibilidade para reconhecer conciliações verdadeiras, porém com risco de aprovar conciliações inexistentes — </w:t>
-      </w:r>
-      <w:r>
-        <w:t>comportamento relevante em um contexto contábil, no qual falsos positivos podem mascarar divergências que demandariam revisão manual.</w:t>
+        <w:t>A matriz de confusão da SVM no cenário exato (Figura 3) detalha a natureza dos erros dos modelos de menor desempenho: dos 1.504 registros do conjunto de teste, o algoritmo classificou corretamente todos os 1.050 pagamentos efetivamente conciliados (nenhum falso negativo), mas atribuiu indevidamente a classe conciliado a 130 dos 454 registros não conciliados. Em termos práticos, isso significa alta sensibilidade para reconhecer conciliações verdadeiras, porém com risco de aprovar conciliações inexistentes — comportamento relevante em um contexto contábil, no qual falsos positivos podem mascarar divergências que demandariam revisão manual.</w:t>
       </w:r>
     </w:p>
     <w:p>
@@ -1863,10 +1852,7 @@
         <w:ind w:firstLine="709"/>
       </w:pPr>
       <w:r>
-        <w:t>Quanto ao efeito do rigor dos critérios, a transição do cenário exato para o flexível, com a introdução de uma classe intermediária de conciliação parcial, não alterou a ordenação dos algoritmos: a Floresta Aleatória permaneceu superior, e os modelos lineares mantiveram desempenho equivalente entre si. Observou-se, todavia, leve redução do F1 macro da SVM e da Regressão Logística no cenário flexível, atribuível à maior dificuldade de separar a classe parcialmente conciliada das demais, o que evidencia que p</w:t>
-      </w:r>
-      <w:r>
-        <w:t>roblemas multiclasse com fronteiras menos nítidas tendem a penalizar mais os algoritmos de fronteira linear do que os baseados em árvores.</w:t>
+        <w:t>Quanto ao efeito do rigor dos critérios, a transição do cenário exato para o flexível, com a introdução de uma classe intermediária de conciliação parcial, não alterou a ordenação dos algoritmos: a Floresta Aleatória permaneceu superior, e os modelos lineares mantiveram desempenho equivalente entre si. Observou-se, todavia, leve redução do F1 macro da SVM e da Regressão Logística no cenário flexível, atribuível à maior dificuldade de separar a classe parcialmente conciliada das demais, o que evidencia que problemas multiclasse com fronteiras menos nítidas tendem a penalizar mais os algoritmos de fronteira linear do que os baseados em árvores.</w:t>
       </w:r>
     </w:p>
     <w:p>
@@ -1913,10 +1899,7 @@
         <w:ind w:firstLine="709"/>
       </w:pPr>
       <w:r>
-        <w:t>Os resultados preliminares obtidos sustentam a hipótese de que a aplicação de algoritmos de aprendizado de máquina, associada a um processo de ETL, é capaz de automatizar a conciliação contábil entre registros de pagamentos e notas fiscais eletrônicas de serviço. Entre os três algoritmos avaliados, a Floresta Aleatória apresentou o melhor desempenho em ambos os cenários de conciliação, seguida, com resultados próximos, pela Máquina de Vetores de Suporte e pela Regressão Logística. A variação do rigor dos cr</w:t>
-      </w:r>
-      <w:r>
-        <w:t>itérios de conciliação não modificou a ordenação dos algoritmos, mas afetou de modo mais acentuado o desempenho dos modelos de fronteira linear no cenário multiclasse. Como próximos passos, prevê-se o aprofundamento da análise de robustez, a investigação do desempenho perfeito da Floresta Aleatória e a discussão dos benefícios e desafios práticos da implementação para a gestão financeira das organizações.</w:t>
+        <w:t>Os resultados preliminares obtidos sustentam a hipótese de que a aplicação de algoritmos de aprendizado de máquina, associada a um processo de ETL, é capaz de automatizar a conciliação contábil entre registros de pagamentos e notas fiscais eletrônicas de serviço. Entre os três algoritmos avaliados, a Floresta Aleatória apresentou o melhor desempenho em ambos os cenários de conciliação, seguida, com resultados próximos, pela Máquina de Vetores de Suporte e pela Regressão Logística. A variação do rigor dos critérios de conciliação não modificou a ordenação dos algoritmos, mas afetou de modo mais acentuado o desempenho dos modelos de fronteira linear no cenário multiclasse. Como próximos passos, prevê-se o aprofundamento da análise de robustez, a investigação do desempenho perfeito da Floresta Aleatória e a discussão dos benefícios e desafios práticos da implementação para a gestão financeira das organizações.</w:t>
       </w:r>
     </w:p>
     <w:p>
@@ -1950,10 +1933,7 @@
         <w:ind w:firstLine="709"/>
       </w:pPr>
       <w:r>
-        <w:t xml:space="preserve">Como continuidade da pesquisa, os próximos passos concentram-se no aprofundamento da análise dos modelos e na consolidação do Trabalho de Conclusão de Curso. No plano metodológico, prevê-se investigar o desempenho perfeito alcançado pela Floresta Aleatória, avaliando a possibilidade de vazamento de informação decorrente da forte dependência entre os atributos de diferença e a regra de rotulagem, bem como introduzir ruído e divergências mais realistas nos dados simulados e, na medida do possível, validar os </w:t>
-      </w:r>
-      <w:r>
-        <w:t>modelos com bases reais. Pretende-se, ainda, ampliar a análise de robustez dos algoritmos e aprofundar a discussão dos benefícios e desafios práticos da adoção da solução para a gestão financeira das organizações.</w:t>
+        <w:t>Como continuidade da pesquisa, os próximos passos concentram-se no aprofundamento da análise dos modelos e na consolidação do Trabalho de Conclusão de Curso. No plano metodológico, prevê-se investigar o desempenho perfeito alcançado pela Floresta Aleatória, avaliando a possibilidade de vazamento de informação decorrente da forte dependência entre os atributos de diferença e a regra de rotulagem, bem como introduzir ruído e divergências mais realistas nos dados simulados e, na medida do possível, validar os modelos com bases reais. Pretende-se, ainda, ampliar a análise de robustez dos algoritmos e aprofundar a discussão dos benefícios e desafios práticos da adoção da solução para a gestão financeira das organizações.</w:t>
       </w:r>
     </w:p>
     <w:p>
@@ -1979,7 +1959,6 @@
           <w:lang w:val="en-US"/>
         </w:rPr>
       </w:pPr>
-      <w:proofErr w:type="spellStart"/>
       <w:r>
         <w:rPr>
           <w:b/>
@@ -1988,7 +1967,6 @@
         <w:lastRenderedPageBreak/>
         <w:t>Referências</w:t>
       </w:r>
-      <w:proofErr w:type="spellEnd"/>
     </w:p>
     <w:p>
       <w:pPr>
@@ -2007,122 +1985,64 @@
         <w:rPr>
           <w:lang w:val="en-US"/>
         </w:rPr>
-        <w:t>Cormier, K. 2025. Data extraction, transformation, and loading (ETL) process automation and data warehouse implementation for algorithmic trading machine learning modelling. In: IEEE International Systems Conference (</w:t>
-      </w:r>
-      <w:proofErr w:type="spellStart"/>
+        <w:t xml:space="preserve">Cormier, K. 2025. Data extraction, transformation, and loading (ETL) process automation and data warehouse implementation for algorithmic trading machine learning modelling. In: IEEE International Systems Conference (SysCon), 2025, Montreal, Canadá. Anais... p. 1-8. </w:t>
+      </w:r>
+      <w:r>
+        <w:t>Disponível em: https://doi.org/10.1109/SysCon64521.2025.11014812. Acesso em: 31 mar. 2026.</w:t>
+      </w:r>
+    </w:p>
+    <w:p>
+      <w:pPr>
+        <w:spacing w:line="240" w:lineRule="auto"/>
+        <w:jc w:val="left"/>
+      </w:pPr>
+      <w:r>
+        <w:t xml:space="preserve">França, R.P.; Monteiro, A.C.B.; Arthur, R.; Iano, Y. 2021. </w:t>
+      </w:r>
       <w:r>
         <w:rPr>
           <w:lang w:val="en-US"/>
         </w:rPr>
-        <w:t>SysCon</w:t>
-      </w:r>
-      <w:proofErr w:type="spellEnd"/>
+        <w:t xml:space="preserve">An overview of deep learning in big data, image, and signal processing in the modern digital age. p. 63-87. In: Piuri, V.; Raj, S.; Genovese, A.; Srivastava, R. Hybrid Computational Intelligence for Pattern Analysis. </w:t>
+      </w:r>
+      <w:r>
+        <w:t>Academic Press. Disponível em: https://doi.org/10.1016/B978-0-12-822226-3.00003-9. Acesso em: 31 mar. 2026.</w:t>
+      </w:r>
+    </w:p>
+    <w:p>
+      <w:pPr>
+        <w:spacing w:line="240" w:lineRule="auto"/>
+        <w:jc w:val="left"/>
+      </w:pPr>
       <w:r>
         <w:rPr>
           <w:lang w:val="en-US"/>
         </w:rPr>
-        <w:t xml:space="preserve">), 2025, Montreal, </w:t>
-      </w:r>
-      <w:proofErr w:type="spellStart"/>
-      <w:r>
+        <w:t xml:space="preserve">Mahmud, A.; Fitriani, N. 2025. The role of financial reconciliation in improving the accuracy of monthly and annual financial reports at CV X. International Journal Administration, Business &amp; Organization 6(2): 301-312. </w:t>
+      </w:r>
+      <w:r>
+        <w:t>Disponível em: https://doi.org/10.61242/ijabo.25.561. Acesso em: 31 mar. 2026.</w:t>
+      </w:r>
+    </w:p>
+    <w:p>
+      <w:pPr>
+        <w:spacing w:line="240" w:lineRule="auto"/>
+        <w:jc w:val="left"/>
         <w:rPr>
           <w:lang w:val="en-US"/>
         </w:rPr>
-        <w:t>Canadá</w:t>
-      </w:r>
-      <w:proofErr w:type="spellEnd"/>
+      </w:pPr>
       <w:r>
         <w:rPr>
           <w:lang w:val="en-US"/>
         </w:rPr>
-        <w:t xml:space="preserve">. Anais... p. 1-8. </w:t>
-      </w:r>
-      <w:r>
-        <w:t>Disponível em: https://doi.org/10.1109/SysCon64521.2025.11014812. Acesso em: 31 mar. 2026.</w:t>
-      </w:r>
-    </w:p>
-    <w:p>
-      <w:pPr>
-        <w:spacing w:line="240" w:lineRule="auto"/>
-        <w:jc w:val="left"/>
-      </w:pPr>
-      <w:r>
-        <w:t xml:space="preserve">França, R.P.; Monteiro, A.C.B.; Arthur, R.; Iano, Y. 2021. </w:t>
+        <w:t xml:space="preserve">Pedregosa, F.; Varoquaux, G.; Gramfort, A.; Michel, V.; Thirion, B.; Grisel, O.; Blondel, M.; Prettenhofer, P.; Weiss, R.; Dubourg, V.; Vanderplas, J.; Passos, A.; Cournapeau, D.; Brucher, M.; Perrot, M.; Duchesnay, É. 2011. </w:t>
       </w:r>
       <w:r>
         <w:rPr>
           <w:lang w:val="en-US"/>
         </w:rPr>
-        <w:t xml:space="preserve">An overview of deep learning in big data, image, and signal processing in the modern digital age. p. 63-87. In: </w:t>
-      </w:r>
-      <w:proofErr w:type="spellStart"/>
-      <w:r>
-        <w:rPr>
-          <w:lang w:val="en-US"/>
-        </w:rPr>
-        <w:t>Piuri</w:t>
-      </w:r>
-      <w:proofErr w:type="spellEnd"/>
-      <w:r>
-        <w:rPr>
-          <w:lang w:val="en-US"/>
-        </w:rPr>
-        <w:t xml:space="preserve">, V.; Raj, S.; Genovese, A.; Srivastava, R. Hybrid Computational Intelligence for Pattern Analysis. </w:t>
-      </w:r>
-      <w:proofErr w:type="spellStart"/>
-      <w:r>
-        <w:t>Academic</w:t>
-      </w:r>
-      <w:proofErr w:type="spellEnd"/>
-      <w:r>
-        <w:t xml:space="preserve"> Press. Disponível em: https://doi.org/10.1016/B978-0-12-822226-3.00003-9. Acesso em: 31 mar. 2026.</w:t>
-      </w:r>
-    </w:p>
-    <w:p>
-      <w:pPr>
-        <w:spacing w:line="240" w:lineRule="auto"/>
-        <w:jc w:val="left"/>
-      </w:pPr>
-      <w:r>
-        <w:rPr>
-          <w:lang w:val="en-US"/>
-        </w:rPr>
-        <w:t xml:space="preserve">Mahmud, A.; Fitriani, N. 2025. The role of financial reconciliation in improving the accuracy of monthly and annual financial reports at CV X. International Journal Administration, Business &amp; Organization 6(2): 301-312. </w:t>
-      </w:r>
-      <w:r>
-        <w:t>Disponível em: https://doi.org/10.61242/ijabo.25.561. Acesso em: 31 mar. 2026.</w:t>
-      </w:r>
-    </w:p>
-    <w:p>
-      <w:pPr>
-        <w:spacing w:line="240" w:lineRule="auto"/>
-        <w:jc w:val="left"/>
-        <w:rPr>
-          <w:lang w:val="en-US"/>
-        </w:rPr>
-      </w:pPr>
-      <w:r>
-        <w:t xml:space="preserve">Pedregosa, F.; Varoquaux, G.; Gramfort, A.; Michel, V.; Thirion, B.; Grisel, O.; Blondel, M.; Prettenhofer, P.; Weiss, R.; Dubourg, V.; Vanderplas, J.; Passos, A.; Cournapeau, D.; Brucher, M.; Perrot, M.; Duchesnay, É. 2011. </w:t>
-      </w:r>
-      <w:r>
-        <w:rPr>
-          <w:lang w:val="en-US"/>
-        </w:rPr>
-        <w:t>Scikit-</w:t>
-      </w:r>
-      <w:proofErr w:type="gramStart"/>
-      <w:r>
-        <w:rPr>
-          <w:lang w:val="en-US"/>
-        </w:rPr>
-        <w:t>learn:</w:t>
-      </w:r>
-      <w:proofErr w:type="gramEnd"/>
-      <w:r>
-        <w:rPr>
-          <w:lang w:val="en-US"/>
-        </w:rPr>
-        <w:t xml:space="preserve"> machine learning in Python. Journal of Machine Learning Research 12: 2825-2830.</w:t>
+        <w:t>Scikit-learn: machine learning in Python. Journal of Machine Learning Research 12: 2825-2830.</w:t>
       </w:r>
     </w:p>
     <w:p>
@@ -3733,10 +3653,6 @@
 </file>
 
 <file path=customXml/item1.xml><?xml version="1.0" encoding="utf-8"?>
-<b:Sources xmlns:b="http://schemas.openxmlformats.org/officeDocument/2006/bibliography" xmlns="http://schemas.openxmlformats.org/officeDocument/2006/bibliography" SelectedStyle="\APA.XSL" StyleName="APA"/>
-</file>
-
-<file path=customXml/item2.xml><?xml version="1.0" encoding="utf-8"?>
 <?mso-contentType ?>
 <FormTemplates xmlns="http://schemas.microsoft.com/sharepoint/v3/contenttype/forms">
   <Display>DocumentLibraryForm</Display>
@@ -3745,7 +3661,22 @@
 </FormTemplates>
 </file>
 
+<file path=customXml/item2.xml><?xml version="1.0" encoding="utf-8"?>
+<b:Sources xmlns:b="http://schemas.openxmlformats.org/officeDocument/2006/bibliography" xmlns="http://schemas.openxmlformats.org/officeDocument/2006/bibliography" SelectedStyle="\APA.XSL" StyleName="APA"/>
+</file>
+
 <file path=customXml/item3.xml><?xml version="1.0" encoding="utf-8"?>
+<p:properties xmlns:p="http://schemas.microsoft.com/office/2006/metadata/properties" xmlns:xsi="http://www.w3.org/2001/XMLSchema-instance" xmlns:pc="http://schemas.microsoft.com/office/infopath/2007/PartnerControls">
+  <documentManagement>
+    <lcf76f155ced4ddcb4097134ff3c332f xmlns="1e7d8aaf-77fb-4419-819f-502bcc31ffe3">
+      <Terms xmlns="http://schemas.microsoft.com/office/infopath/2007/PartnerControls"/>
+    </lcf76f155ced4ddcb4097134ff3c332f>
+    <TaxCatchAll xmlns="2c89dc19-a755-4b1f-8ccb-ddc282e02978" xsi:nil="true"/>
+  </documentManagement>
+</p:properties>
+</file>
+
+<file path=customXml/item4.xml><?xml version="1.0" encoding="utf-8"?>
 <ct:contentTypeSchema xmlns:ct="http://schemas.microsoft.com/office/2006/metadata/contentType" xmlns:ma="http://schemas.microsoft.com/office/2006/metadata/properties/metaAttributes" ct:_="" ma:_="" ma:contentTypeName="Documento" ma:contentTypeID="0x01010008CFA7B293EDBE4DB98FBC161D82B39F" ma:contentTypeVersion="15" ma:contentTypeDescription="Crie um novo documento." ma:contentTypeScope="" ma:versionID="ed78836dbbd60ef5b47f46abba0ddc66">
   <xsd:schema xmlns:xsd="http://www.w3.org/2001/XMLSchema" xmlns:xs="http://www.w3.org/2001/XMLSchema" xmlns:p="http://schemas.microsoft.com/office/2006/metadata/properties" xmlns:ns2="2c89dc19-a755-4b1f-8ccb-ddc282e02978" xmlns:ns3="1e7d8aaf-77fb-4419-819f-502bcc31ffe3" targetNamespace="http://schemas.microsoft.com/office/2006/metadata/properties" ma:root="true" ma:fieldsID="f28b1225859e7fd7734d1009df438026" ns2:_="" ns3:_="">
     <xsd:import namespace="2c89dc19-a755-4b1f-8ccb-ddc282e02978"/>
@@ -3980,18 +3911,15 @@
 </ct:contentTypeSchema>
 </file>
 
-<file path=customXml/item4.xml><?xml version="1.0" encoding="utf-8"?>
-<p:properties xmlns:p="http://schemas.microsoft.com/office/2006/metadata/properties" xmlns:xsi="http://www.w3.org/2001/XMLSchema-instance" xmlns:pc="http://schemas.microsoft.com/office/infopath/2007/PartnerControls">
-  <documentManagement>
-    <lcf76f155ced4ddcb4097134ff3c332f xmlns="1e7d8aaf-77fb-4419-819f-502bcc31ffe3">
-      <Terms xmlns="http://schemas.microsoft.com/office/infopath/2007/PartnerControls"/>
-    </lcf76f155ced4ddcb4097134ff3c332f>
-    <TaxCatchAll xmlns="2c89dc19-a755-4b1f-8ccb-ddc282e02978" xsi:nil="true"/>
-  </documentManagement>
-</p:properties>
+<file path=customXml/itemProps1.xml><?xml version="1.0" encoding="utf-8"?>
+<ds:datastoreItem xmlns:ds="http://schemas.openxmlformats.org/officeDocument/2006/customXml" ds:itemID="{36B1F55A-1B2E-4506-A75A-A779262F9C9D}">
+  <ds:schemaRefs>
+    <ds:schemaRef ds:uri="http://schemas.microsoft.com/sharepoint/v3/contenttype/forms"/>
+  </ds:schemaRefs>
+</ds:datastoreItem>
 </file>
 
-<file path=customXml/itemProps1.xml><?xml version="1.0" encoding="utf-8"?>
+<file path=customXml/itemProps2.xml><?xml version="1.0" encoding="utf-8"?>
 <ds:datastoreItem xmlns:ds="http://schemas.openxmlformats.org/officeDocument/2006/customXml" ds:itemID="{B4331BC3-D36B-4434-A1AC-77D96D6F5401}">
   <ds:schemaRefs>
     <ds:schemaRef ds:uri="http://schemas.openxmlformats.org/officeDocument/2006/bibliography"/>
@@ -3999,15 +3927,18 @@
 </ds:datastoreItem>
 </file>
 
-<file path=customXml/itemProps2.xml><?xml version="1.0" encoding="utf-8"?>
-<ds:datastoreItem xmlns:ds="http://schemas.openxmlformats.org/officeDocument/2006/customXml" ds:itemID="{36B1F55A-1B2E-4506-A75A-A779262F9C9D}">
+<file path=customXml/itemProps3.xml><?xml version="1.0" encoding="utf-8"?>
+<ds:datastoreItem xmlns:ds="http://schemas.openxmlformats.org/officeDocument/2006/customXml" ds:itemID="{0BFFF7C0-7312-4E0E-A444-E10184C0C7F1}">
   <ds:schemaRefs>
-    <ds:schemaRef ds:uri="http://schemas.microsoft.com/sharepoint/v3/contenttype/forms"/>
+    <ds:schemaRef ds:uri="http://schemas.microsoft.com/office/2006/metadata/properties"/>
+    <ds:schemaRef ds:uri="http://schemas.microsoft.com/office/infopath/2007/PartnerControls"/>
+    <ds:schemaRef ds:uri="1e7d8aaf-77fb-4419-819f-502bcc31ffe3"/>
+    <ds:schemaRef ds:uri="2c89dc19-a755-4b1f-8ccb-ddc282e02978"/>
   </ds:schemaRefs>
 </ds:datastoreItem>
 </file>
 
-<file path=customXml/itemProps3.xml><?xml version="1.0" encoding="utf-8"?>
+<file path=customXml/itemProps4.xml><?xml version="1.0" encoding="utf-8"?>
 <ds:datastoreItem xmlns:ds="http://schemas.openxmlformats.org/officeDocument/2006/customXml" ds:itemID="{F58AD907-4B6B-438E-930A-AF1D9E8983ED}">
   <ds:schemaRefs>
     <ds:schemaRef ds:uri="http://schemas.microsoft.com/office/2006/metadata/contentType"/>
@@ -4024,15 +3955,4 @@
     <ds:schemaRef ds:uri="http://schemas.microsoft.com/internal/obd"/>
   </ds:schemaRefs>
 </ds:datastoreItem>
-</file>
-
-<file path=customXml/itemProps4.xml><?xml version="1.0" encoding="utf-8"?>
-<ds:datastoreItem xmlns:ds="http://schemas.openxmlformats.org/officeDocument/2006/customXml" ds:itemID="{0BFFF7C0-7312-4E0E-A444-E10184C0C7F1}">
-  <ds:schemaRefs>
-    <ds:schemaRef ds:uri="http://schemas.microsoft.com/office/2006/metadata/properties"/>
-    <ds:schemaRef ds:uri="http://schemas.microsoft.com/office/infopath/2007/PartnerControls"/>
-    <ds:schemaRef ds:uri="1e7d8aaf-77fb-4419-819f-502bcc31ffe3"/>
-    <ds:schemaRef ds:uri="2c89dc19-a755-4b1f-8ccb-ddc282e02978"/>
-  </ds:schemaRefs>
-</ds:datastoreItem>
 </file>
</xml_diff>